<commit_message>
docs: update legal review checklist for the two-account household model
Refresh the couples items (F6, A10, G5) in the counsel sign-off checklist to
reflect the shipped two-account household model: the tier is now OPEN, each
spouse holds their own login + document set, and the joint trust is shared — so
the survivor can reach the will that names them (the exact gap that had kept the
tier closed). Kept all three as OPEN items for counsel (approve joint-trust
language + new model; advise on any earlier single-account sale). No other items
changed — every A–H item still requires attorney sign-off.

Co-Authored-By: Claude Opus 4.8 <noreply@anthropic.com>
</commit_message>
<xml_diff>
--- a/docs/LEGAL_REVIEW_CHECKLIST.docx
+++ b/docs/LEGAL_REVIEW_CHECKLIST.docx
@@ -1489,7 +1489,7 @@
                 <w:sz w:val="17"/>
                 <w:szCs w:val="17"/>
               </w:rPr>
-              <w:t xml:space="preserve">Approve the mirroring approach and the joint trust language. NOTE: this tier is not currently on sale — see F6.</w:t>
+              <w:t xml:space="preserve">Approve the mirroring approach and the joint trust language. NOTE: this tier is now ON SALE — the two-account household model shipped (Aug 2026), so each spouse holds their own login and document set. See F6.</w:t>
             </w:r>
           </w:p>
         </w:tc>
@@ -7065,23 +7065,23 @@
                 <w:sz w:val="17"/>
                 <w:szCs w:val="17"/>
               </w:rPr>
-              <w:t xml:space="preserve">Couples: one account holds both spouses’ documents</w:t>
-            </w:r>
-          </w:p>
-          <w:p>
-            <w:pPr>
-              <w:spacing w:after="0" w:line="250"/>
-            </w:pPr>
-            <w:r>
-              <w:rPr>
-                <w:rFonts w:ascii="Calibri" w:cs="Calibri" w:eastAsia="Calibri" w:hAnsi="Calibri"/>
-                <w:b w:val="false"/>
-                <w:bCs w:val="false"/>
-                <w:color w:val="1A2230"/>
-                <w:sz w:val="17"/>
-                <w:szCs w:val="17"/>
-              </w:rPr>
-              <w:t xml:space="preserve">The tier is CLOSED for this reason. Generation produces both spouses’ full sets, but they land in one account and the second spouse gets no login. If the account holder dies, the survivor cannot reach the will that names them.</w:t>
+              <w:t xml:space="preserve">Couples: two accounts, one shared household</w:t>
+            </w:r>
+          </w:p>
+          <w:p>
+            <w:pPr>
+              <w:spacing w:after="0" w:line="250"/>
+            </w:pPr>
+            <w:r>
+              <w:rPr>
+                <w:rFonts w:ascii="Calibri" w:cs="Calibri" w:eastAsia="Calibri" w:hAnsi="Calibri"/>
+                <w:b w:val="false"/>
+                <w:bCs w:val="false"/>
+                <w:color w:val="1A2230"/>
+                <w:sz w:val="17"/>
+                <w:szCs w:val="17"/>
+              </w:rPr>
+              <w:t xml:space="preserve">The tier is now OPEN. The two-account household model shipped (migrations 15–16; docs/HOUSEHOLD_WORK_ORDER.md): each spouse creates their own login and owns their own document set, and the joint trust is shared across the household — so if the account holder dies, the survivor can still reach the will that names them. That was the exact gap that had kept the tier closed.</w:t>
             </w:r>
           </w:p>
         </w:tc>
@@ -7137,7 +7137,7 @@
                 <w:sz w:val="17"/>
                 <w:szCs w:val="17"/>
               </w:rPr>
-              <w:t xml:space="preserve">Advise on the risk of having sold this during testing, if any sales occurred, and on what the household model must guarantee before the tier reopens.</w:t>
+              <w:t xml:space="preserve">The tier has reopened on the two-account household model. Approve the joint-trust sharing and the mirroring approach (see A10), confirm the model adequately guarantees each spouse’s independent, permanent access to their own documents, and advise on the risk of any single-account couples sale taken during the earlier phase (see G5).</w:t>
             </w:r>
           </w:p>
         </w:tc>
@@ -8172,7 +8172,7 @@
                 <w:sz w:val="17"/>
                 <w:szCs w:val="17"/>
               </w:rPr>
-              <w:t xml:space="preserve">Couples pricing was live earlier in testing. If any couples purchase was taken, both spouses’ documents sit in one account.</w:t>
+              <w:t xml:space="preserve">During an earlier single-account phase of testing, couples pricing was briefly live. If any couples purchase was taken then, both spouses’ documents sat in one account. The tier has since reopened on the two-account household model, which does not have this problem.</w:t>
             </w:r>
           </w:p>
         </w:tc>
@@ -8226,7 +8226,7 @@
                 <w:sz w:val="17"/>
                 <w:szCs w:val="17"/>
               </w:rPr>
-              <w:t xml:space="preserve">Advise on remediation if any such sale exists.</w:t>
+              <w:t xml:space="preserve">Advise on remediation if any such single-account sale exists.</w:t>
             </w:r>
           </w:p>
         </w:tc>

</xml_diff>

<commit_message>
docs: add live GitHub source links to legal review checklist
Hyperlink every real "Where it lives" path (34 links) to the source on GitHub,
pinned to commit f995cb1 so counsel reviews a stable snapshot. Content is
unchanged from the prior commit; only the file-path cells became clickable.
Descriptive non-path entries left as plain text.

Co-Authored-By: Claude Opus 4.8 <noreply@anthropic.com>
</commit_message>
<xml_diff>
--- a/docs/LEGAL_REVIEW_CHECKLIST.docx
+++ b/docs/LEGAL_REVIEW_CHECKLIST.docx
@@ -368,17 +368,20 @@
             <w:pPr>
               <w:spacing w:after="0" w:line="250"/>
             </w:pPr>
-            <w:r>
-              <w:rPr>
-                <w:rFonts w:ascii="Calibri" w:cs="Calibri" w:eastAsia="Calibri" w:hAnsi="Calibri"/>
-                <w:b w:val="false"/>
-                <w:bCs w:val="false"/>
-                <w:color w:val="5A6472"/>
-                <w:sz w:val="15"/>
-                <w:szCs w:val="15"/>
-              </w:rPr>
-              <w:t xml:space="preserve">src/lib/documents/will.ts</w:t>
-            </w:r>
+            <w:hyperlink r:id="rHl1">
+              <w:r>
+                <w:rPr>
+                  <w:rFonts w:ascii="Calibri" w:cs="Calibri" w:eastAsia="Calibri" w:hAnsi="Calibri"/>
+                  <w:b w:val="false"/>
+                  <w:bCs w:val="false"/>
+                  <w:color w:val="0563C1"/>
+                  <w:u w:val="single"/>
+                  <w:sz w:val="15"/>
+                  <w:szCs w:val="15"/>
+                </w:rPr>
+                <w:t xml:space="preserve">src/lib/documents/will.ts</w:t>
+              </w:r>
+            </w:hyperlink>
           </w:p>
         </w:tc>
         <w:tc>
@@ -484,17 +487,20 @@
             <w:pPr>
               <w:spacing w:after="0" w:line="250"/>
             </w:pPr>
-            <w:r>
-              <w:rPr>
-                <w:rFonts w:ascii="Calibri" w:cs="Calibri" w:eastAsia="Calibri" w:hAnsi="Calibri"/>
-                <w:b w:val="false"/>
-                <w:bCs w:val="false"/>
-                <w:color w:val="5A6472"/>
-                <w:sz w:val="15"/>
-                <w:szCs w:val="15"/>
-              </w:rPr>
-              <w:t xml:space="preserve">src/lib/documents/trust.ts</w:t>
-            </w:r>
+            <w:hyperlink r:id="rHl2">
+              <w:r>
+                <w:rPr>
+                  <w:rFonts w:ascii="Calibri" w:cs="Calibri" w:eastAsia="Calibri" w:hAnsi="Calibri"/>
+                  <w:b w:val="false"/>
+                  <w:bCs w:val="false"/>
+                  <w:color w:val="0563C1"/>
+                  <w:u w:val="single"/>
+                  <w:sz w:val="15"/>
+                  <w:szCs w:val="15"/>
+                </w:rPr>
+                <w:t xml:space="preserve">src/lib/documents/trust.ts</w:t>
+              </w:r>
+            </w:hyperlink>
           </w:p>
         </w:tc>
         <w:tc>
@@ -598,17 +604,20 @@
             <w:pPr>
               <w:spacing w:after="0" w:line="250"/>
             </w:pPr>
-            <w:r>
-              <w:rPr>
-                <w:rFonts w:ascii="Calibri" w:cs="Calibri" w:eastAsia="Calibri" w:hAnsi="Calibri"/>
-                <w:b w:val="false"/>
-                <w:bCs w:val="false"/>
-                <w:color w:val="5A6472"/>
-                <w:sz w:val="15"/>
-                <w:szCs w:val="15"/>
-              </w:rPr>
-              <w:t xml:space="preserve">src/lib/documents/trust.ts</w:t>
-            </w:r>
+            <w:hyperlink r:id="rHl2">
+              <w:r>
+                <w:rPr>
+                  <w:rFonts w:ascii="Calibri" w:cs="Calibri" w:eastAsia="Calibri" w:hAnsi="Calibri"/>
+                  <w:b w:val="false"/>
+                  <w:bCs w:val="false"/>
+                  <w:color w:val="0563C1"/>
+                  <w:u w:val="single"/>
+                  <w:sz w:val="15"/>
+                  <w:szCs w:val="15"/>
+                </w:rPr>
+                <w:t xml:space="preserve">src/lib/documents/trust.ts</w:t>
+              </w:r>
+            </w:hyperlink>
           </w:p>
         </w:tc>
         <w:tc>
@@ -714,17 +723,20 @@
             <w:pPr>
               <w:spacing w:after="0" w:line="250"/>
             </w:pPr>
-            <w:r>
-              <w:rPr>
-                <w:rFonts w:ascii="Calibri" w:cs="Calibri" w:eastAsia="Calibri" w:hAnsi="Calibri"/>
-                <w:b w:val="false"/>
-                <w:bCs w:val="false"/>
-                <w:color w:val="5A6472"/>
-                <w:sz w:val="15"/>
-                <w:szCs w:val="15"/>
-              </w:rPr>
-              <w:t xml:space="preserve">src/lib/documents/ancillary.ts</w:t>
-            </w:r>
+            <w:hyperlink r:id="rHl3">
+              <w:r>
+                <w:rPr>
+                  <w:rFonts w:ascii="Calibri" w:cs="Calibri" w:eastAsia="Calibri" w:hAnsi="Calibri"/>
+                  <w:b w:val="false"/>
+                  <w:bCs w:val="false"/>
+                  <w:color w:val="0563C1"/>
+                  <w:u w:val="single"/>
+                  <w:sz w:val="15"/>
+                  <w:szCs w:val="15"/>
+                </w:rPr>
+                <w:t xml:space="preserve">src/lib/documents/ancillary.ts</w:t>
+              </w:r>
+            </w:hyperlink>
           </w:p>
         </w:tc>
         <w:tc>
@@ -828,17 +840,20 @@
             <w:pPr>
               <w:spacing w:after="0" w:line="250"/>
             </w:pPr>
-            <w:r>
-              <w:rPr>
-                <w:rFonts w:ascii="Calibri" w:cs="Calibri" w:eastAsia="Calibri" w:hAnsi="Calibri"/>
-                <w:b w:val="false"/>
-                <w:bCs w:val="false"/>
-                <w:color w:val="5A6472"/>
-                <w:sz w:val="15"/>
-                <w:szCs w:val="15"/>
-              </w:rPr>
-              <w:t xml:space="preserve">src/lib/documents/ancillary.ts</w:t>
-            </w:r>
+            <w:hyperlink r:id="rHl3">
+              <w:r>
+                <w:rPr>
+                  <w:rFonts w:ascii="Calibri" w:cs="Calibri" w:eastAsia="Calibri" w:hAnsi="Calibri"/>
+                  <w:b w:val="false"/>
+                  <w:bCs w:val="false"/>
+                  <w:color w:val="0563C1"/>
+                  <w:u w:val="single"/>
+                  <w:sz w:val="15"/>
+                  <w:szCs w:val="15"/>
+                </w:rPr>
+                <w:t xml:space="preserve">src/lib/documents/ancillary.ts</w:t>
+              </w:r>
+            </w:hyperlink>
           </w:p>
         </w:tc>
         <w:tc>
@@ -944,17 +959,20 @@
             <w:pPr>
               <w:spacing w:after="0" w:line="250"/>
             </w:pPr>
-            <w:r>
-              <w:rPr>
-                <w:rFonts w:ascii="Calibri" w:cs="Calibri" w:eastAsia="Calibri" w:hAnsi="Calibri"/>
-                <w:b w:val="false"/>
-                <w:bCs w:val="false"/>
-                <w:color w:val="5A6472"/>
-                <w:sz w:val="15"/>
-                <w:szCs w:val="15"/>
-              </w:rPr>
-              <w:t xml:space="preserve">src/lib/documents/ancillary.ts</w:t>
-            </w:r>
+            <w:hyperlink r:id="rHl3">
+              <w:r>
+                <w:rPr>
+                  <w:rFonts w:ascii="Calibri" w:cs="Calibri" w:eastAsia="Calibri" w:hAnsi="Calibri"/>
+                  <w:b w:val="false"/>
+                  <w:bCs w:val="false"/>
+                  <w:color w:val="0563C1"/>
+                  <w:u w:val="single"/>
+                  <w:sz w:val="15"/>
+                  <w:szCs w:val="15"/>
+                </w:rPr>
+                <w:t xml:space="preserve">src/lib/documents/ancillary.ts</w:t>
+              </w:r>
+            </w:hyperlink>
           </w:p>
         </w:tc>
         <w:tc>
@@ -1190,17 +1208,20 @@
             <w:pPr>
               <w:spacing w:after="0" w:line="250"/>
             </w:pPr>
-            <w:r>
-              <w:rPr>
-                <w:rFonts w:ascii="Calibri" w:cs="Calibri" w:eastAsia="Calibri" w:hAnsi="Calibri"/>
-                <w:b w:val="false"/>
-                <w:bCs w:val="false"/>
-                <w:color w:val="5A6472"/>
-                <w:sz w:val="15"/>
-                <w:szCs w:val="15"/>
-              </w:rPr>
-              <w:t xml:space="preserve">src/lib/documents/ancillary.ts</w:t>
-            </w:r>
+            <w:hyperlink r:id="rHl3">
+              <w:r>
+                <w:rPr>
+                  <w:rFonts w:ascii="Calibri" w:cs="Calibri" w:eastAsia="Calibri" w:hAnsi="Calibri"/>
+                  <w:b w:val="false"/>
+                  <w:bCs w:val="false"/>
+                  <w:color w:val="0563C1"/>
+                  <w:u w:val="single"/>
+                  <w:sz w:val="15"/>
+                  <w:szCs w:val="15"/>
+                </w:rPr>
+                <w:t xml:space="preserve">src/lib/documents/ancillary.ts</w:t>
+              </w:r>
+            </w:hyperlink>
           </w:p>
         </w:tc>
         <w:tc>
@@ -1320,17 +1341,20 @@
             <w:pPr>
               <w:spacing w:after="0" w:line="250"/>
             </w:pPr>
-            <w:r>
-              <w:rPr>
-                <w:rFonts w:ascii="Calibri" w:cs="Calibri" w:eastAsia="Calibri" w:hAnsi="Calibri"/>
-                <w:b w:val="false"/>
-                <w:bCs w:val="false"/>
-                <w:color w:val="5A6472"/>
-                <w:sz w:val="15"/>
-                <w:szCs w:val="15"/>
-              </w:rPr>
-              <w:t xml:space="preserve">src/lib/documents/will.ts</w:t>
-            </w:r>
+            <w:hyperlink r:id="rHl1">
+              <w:r>
+                <w:rPr>
+                  <w:rFonts w:ascii="Calibri" w:cs="Calibri" w:eastAsia="Calibri" w:hAnsi="Calibri"/>
+                  <w:b w:val="false"/>
+                  <w:bCs w:val="false"/>
+                  <w:color w:val="0563C1"/>
+                  <w:u w:val="single"/>
+                  <w:sz w:val="15"/>
+                  <w:szCs w:val="15"/>
+                </w:rPr>
+                <w:t xml:space="preserve">src/lib/documents/will.ts</w:t>
+              </w:r>
+            </w:hyperlink>
           </w:p>
         </w:tc>
         <w:tc>
@@ -1452,17 +1476,20 @@
             <w:pPr>
               <w:spacing w:after="0" w:line="250"/>
             </w:pPr>
-            <w:r>
-              <w:rPr>
-                <w:rFonts w:ascii="Calibri" w:cs="Calibri" w:eastAsia="Calibri" w:hAnsi="Calibri"/>
-                <w:b w:val="false"/>
-                <w:bCs w:val="false"/>
-                <w:color w:val="5A6472"/>
-                <w:sz w:val="15"/>
-                <w:szCs w:val="15"/>
-              </w:rPr>
-              <w:t xml:space="preserve">src/lib/documents/couples.ts</w:t>
-            </w:r>
+            <w:hyperlink r:id="rHl4">
+              <w:r>
+                <w:rPr>
+                  <w:rFonts w:ascii="Calibri" w:cs="Calibri" w:eastAsia="Calibri" w:hAnsi="Calibri"/>
+                  <w:b w:val="false"/>
+                  <w:bCs w:val="false"/>
+                  <w:color w:val="0563C1"/>
+                  <w:u w:val="single"/>
+                  <w:sz w:val="15"/>
+                  <w:szCs w:val="15"/>
+                </w:rPr>
+                <w:t xml:space="preserve">src/lib/documents/couples.ts</w:t>
+              </w:r>
+            </w:hyperlink>
           </w:p>
         </w:tc>
         <w:tc>
@@ -1582,17 +1609,20 @@
             <w:pPr>
               <w:spacing w:after="0" w:line="250"/>
             </w:pPr>
-            <w:r>
-              <w:rPr>
-                <w:rFonts w:ascii="Calibri" w:cs="Calibri" w:eastAsia="Calibri" w:hAnsi="Calibri"/>
-                <w:b w:val="false"/>
-                <w:bCs w:val="false"/>
-                <w:color w:val="5A6472"/>
-                <w:sz w:val="15"/>
-                <w:szCs w:val="15"/>
-              </w:rPr>
-              <w:t xml:space="preserve">src/lib/documents/docx.ts</w:t>
-            </w:r>
+            <w:hyperlink r:id="rHl5">
+              <w:r>
+                <w:rPr>
+                  <w:rFonts w:ascii="Calibri" w:cs="Calibri" w:eastAsia="Calibri" w:hAnsi="Calibri"/>
+                  <w:b w:val="false"/>
+                  <w:bCs w:val="false"/>
+                  <w:color w:val="0563C1"/>
+                  <w:u w:val="single"/>
+                  <w:sz w:val="15"/>
+                  <w:szCs w:val="15"/>
+                </w:rPr>
+                <w:t xml:space="preserve">src/lib/documents/docx.ts</w:t>
+              </w:r>
+            </w:hyperlink>
           </w:p>
         </w:tc>
         <w:tc>
@@ -1714,17 +1744,20 @@
             <w:pPr>
               <w:spacing w:after="0" w:line="250"/>
             </w:pPr>
-            <w:r>
-              <w:rPr>
-                <w:rFonts w:ascii="Calibri" w:cs="Calibri" w:eastAsia="Calibri" w:hAnsi="Calibri"/>
-                <w:b w:val="false"/>
-                <w:bCs w:val="false"/>
-                <w:color w:val="5A6472"/>
-                <w:sz w:val="15"/>
-                <w:szCs w:val="15"/>
-              </w:rPr>
-              <w:t xml:space="preserve">src/lib/documents/execution-instructions.ts</w:t>
-            </w:r>
+            <w:hyperlink r:id="rHl6">
+              <w:r>
+                <w:rPr>
+                  <w:rFonts w:ascii="Calibri" w:cs="Calibri" w:eastAsia="Calibri" w:hAnsi="Calibri"/>
+                  <w:b w:val="false"/>
+                  <w:bCs w:val="false"/>
+                  <w:color w:val="0563C1"/>
+                  <w:u w:val="single"/>
+                  <w:sz w:val="15"/>
+                  <w:szCs w:val="15"/>
+                </w:rPr>
+                <w:t xml:space="preserve">src/lib/documents/execution-instructions.ts</w:t>
+              </w:r>
+            </w:hyperlink>
           </w:p>
         </w:tc>
         <w:tc>
@@ -2058,6 +2091,20 @@
             <w:pPr>
               <w:spacing w:after="0" w:line="250"/>
             </w:pPr>
+            <w:hyperlink r:id="rHl16">
+              <w:r>
+                <w:rPr>
+                  <w:rFonts w:ascii="Calibri" w:cs="Calibri" w:eastAsia="Calibri" w:hAnsi="Calibri"/>
+                  <w:b w:val="false"/>
+                  <w:bCs w:val="false"/>
+                  <w:color w:val="0563C1"/>
+                  <w:u w:val="single"/>
+                  <w:sz w:val="15"/>
+                  <w:szCs w:val="15"/>
+                </w:rPr>
+                <w:t xml:space="preserve">supabase/seed.sql</w:t>
+              </w:r>
+            </w:hyperlink>
             <w:r>
               <w:rPr>
                 <w:rFonts w:ascii="Calibri" w:cs="Calibri" w:eastAsia="Calibri" w:hAnsi="Calibri"/>
@@ -2067,8 +2114,22 @@
                 <w:sz w:val="15"/>
                 <w:szCs w:val="15"/>
               </w:rPr>
-              <w:t xml:space="preserve">supabase/seed.sql; migration 20260712000011_state_qa.sql</w:t>
-            </w:r>
+              <w:t xml:space="preserve">; migration </w:t>
+            </w:r>
+            <w:hyperlink r:id="rHl23">
+              <w:r>
+                <w:rPr>
+                  <w:rFonts w:ascii="Calibri" w:cs="Calibri" w:eastAsia="Calibri" w:hAnsi="Calibri"/>
+                  <w:b w:val="false"/>
+                  <w:bCs w:val="false"/>
+                  <w:color w:val="0563C1"/>
+                  <w:u w:val="single"/>
+                  <w:sz w:val="15"/>
+                  <w:szCs w:val="15"/>
+                </w:rPr>
+                <w:t xml:space="preserve">20260712000011_state_qa.sql</w:t>
+              </w:r>
+            </w:hyperlink>
           </w:p>
         </w:tc>
         <w:tc>
@@ -2190,17 +2251,20 @@
             <w:pPr>
               <w:spacing w:after="0" w:line="250"/>
             </w:pPr>
-            <w:r>
-              <w:rPr>
-                <w:rFonts w:ascii="Calibri" w:cs="Calibri" w:eastAsia="Calibri" w:hAnsi="Calibri"/>
-                <w:b w:val="false"/>
-                <w:bCs w:val="false"/>
-                <w:color w:val="5A6472"/>
-                <w:sz w:val="15"/>
-                <w:szCs w:val="15"/>
-              </w:rPr>
-              <w:t xml:space="preserve">docs/STATE_RULES_QA.md</w:t>
-            </w:r>
+            <w:hyperlink r:id="rHl7">
+              <w:r>
+                <w:rPr>
+                  <w:rFonts w:ascii="Calibri" w:cs="Calibri" w:eastAsia="Calibri" w:hAnsi="Calibri"/>
+                  <w:b w:val="false"/>
+                  <w:bCs w:val="false"/>
+                  <w:color w:val="0563C1"/>
+                  <w:u w:val="single"/>
+                  <w:sz w:val="15"/>
+                  <w:szCs w:val="15"/>
+                </w:rPr>
+                <w:t xml:space="preserve">docs/STATE_RULES_QA.md</w:t>
+              </w:r>
+            </w:hyperlink>
           </w:p>
         </w:tc>
         <w:tc>
@@ -2452,17 +2516,20 @@
             <w:pPr>
               <w:spacing w:after="0" w:line="250"/>
             </w:pPr>
-            <w:r>
-              <w:rPr>
-                <w:rFonts w:ascii="Calibri" w:cs="Calibri" w:eastAsia="Calibri" w:hAnsi="Calibri"/>
-                <w:b w:val="false"/>
-                <w:bCs w:val="false"/>
-                <w:color w:val="5A6472"/>
-                <w:sz w:val="15"/>
-                <w:szCs w:val="15"/>
-              </w:rPr>
-              <w:t xml:space="preserve">supabase/seed.sql</w:t>
-            </w:r>
+            <w:hyperlink r:id="rHl16">
+              <w:r>
+                <w:rPr>
+                  <w:rFonts w:ascii="Calibri" w:cs="Calibri" w:eastAsia="Calibri" w:hAnsi="Calibri"/>
+                  <w:b w:val="false"/>
+                  <w:bCs w:val="false"/>
+                  <w:color w:val="0563C1"/>
+                  <w:u w:val="single"/>
+                  <w:sz w:val="15"/>
+                  <w:szCs w:val="15"/>
+                </w:rPr>
+                <w:t xml:space="preserve">supabase/seed.sql</w:t>
+              </w:r>
+            </w:hyperlink>
           </w:p>
         </w:tc>
         <w:tc>
@@ -2582,17 +2649,20 @@
             <w:pPr>
               <w:spacing w:after="0" w:line="250"/>
             </w:pPr>
-            <w:r>
-              <w:rPr>
-                <w:rFonts w:ascii="Calibri" w:cs="Calibri" w:eastAsia="Calibri" w:hAnsi="Calibri"/>
-                <w:b w:val="false"/>
-                <w:bCs w:val="false"/>
-                <w:color w:val="5A6472"/>
-                <w:sz w:val="15"/>
-                <w:szCs w:val="15"/>
-              </w:rPr>
-              <w:t xml:space="preserve">supabase/seed.sql</w:t>
-            </w:r>
+            <w:hyperlink r:id="rHl16">
+              <w:r>
+                <w:rPr>
+                  <w:rFonts w:ascii="Calibri" w:cs="Calibri" w:eastAsia="Calibri" w:hAnsi="Calibri"/>
+                  <w:b w:val="false"/>
+                  <w:bCs w:val="false"/>
+                  <w:color w:val="0563C1"/>
+                  <w:u w:val="single"/>
+                  <w:sz w:val="15"/>
+                  <w:szCs w:val="15"/>
+                </w:rPr>
+                <w:t xml:space="preserve">supabase/seed.sql</w:t>
+              </w:r>
+            </w:hyperlink>
           </w:p>
         </w:tc>
         <w:tc>
@@ -3290,17 +3360,20 @@
             <w:pPr>
               <w:spacing w:after="0" w:line="250"/>
             </w:pPr>
-            <w:r>
-              <w:rPr>
-                <w:rFonts w:ascii="Calibri" w:cs="Calibri" w:eastAsia="Calibri" w:hAnsi="Calibri"/>
-                <w:b w:val="false"/>
-                <w:bCs w:val="false"/>
-                <w:color w:val="5A6472"/>
-                <w:sz w:val="15"/>
-                <w:szCs w:val="15"/>
-              </w:rPr>
-              <w:t xml:space="preserve">src/components/interview</w:t>
-            </w:r>
+            <w:hyperlink r:id="rHl17">
+              <w:r>
+                <w:rPr>
+                  <w:rFonts w:ascii="Calibri" w:cs="Calibri" w:eastAsia="Calibri" w:hAnsi="Calibri"/>
+                  <w:b w:val="false"/>
+                  <w:bCs w:val="false"/>
+                  <w:color w:val="0563C1"/>
+                  <w:u w:val="single"/>
+                  <w:sz w:val="15"/>
+                  <w:szCs w:val="15"/>
+                </w:rPr>
+                <w:t xml:space="preserve">src/components/interview</w:t>
+              </w:r>
+            </w:hyperlink>
           </w:p>
         </w:tc>
         <w:tc>
@@ -3552,17 +3625,20 @@
             <w:pPr>
               <w:spacing w:after="0" w:line="250"/>
             </w:pPr>
-            <w:r>
-              <w:rPr>
-                <w:rFonts w:ascii="Calibri" w:cs="Calibri" w:eastAsia="Calibri" w:hAnsi="Calibri"/>
-                <w:b w:val="false"/>
-                <w:bCs w:val="false"/>
-                <w:color w:val="5A6472"/>
-                <w:sz w:val="15"/>
-                <w:szCs w:val="15"/>
-              </w:rPr>
-              <w:t xml:space="preserve">src/lib/attorney-referrals.ts</w:t>
-            </w:r>
+            <w:hyperlink r:id="rHl8">
+              <w:r>
+                <w:rPr>
+                  <w:rFonts w:ascii="Calibri" w:cs="Calibri" w:eastAsia="Calibri" w:hAnsi="Calibri"/>
+                  <w:b w:val="false"/>
+                  <w:bCs w:val="false"/>
+                  <w:color w:val="0563C1"/>
+                  <w:u w:val="single"/>
+                  <w:sz w:val="15"/>
+                  <w:szCs w:val="15"/>
+                </w:rPr>
+                <w:t xml:space="preserve">src/lib/attorney-referrals.ts</w:t>
+              </w:r>
+            </w:hyperlink>
           </w:p>
         </w:tc>
         <w:tc>
@@ -3814,6 +3890,20 @@
             <w:pPr>
               <w:spacing w:after="0" w:line="250"/>
             </w:pPr>
+            <w:hyperlink r:id="rHl22">
+              <w:r>
+                <w:rPr>
+                  <w:rFonts w:ascii="Calibri" w:cs="Calibri" w:eastAsia="Calibri" w:hAnsi="Calibri"/>
+                  <w:b w:val="false"/>
+                  <w:bCs w:val="false"/>
+                  <w:color w:val="0563C1"/>
+                  <w:u w:val="single"/>
+                  <w:sz w:val="15"/>
+                  <w:szCs w:val="15"/>
+                </w:rPr>
+                <w:t xml:space="preserve">docs/MARKETING_GUIDE.md</w:t>
+              </w:r>
+            </w:hyperlink>
             <w:r>
               <w:rPr>
                 <w:rFonts w:ascii="Calibri" w:cs="Calibri" w:eastAsia="Calibri" w:hAnsi="Calibri"/>
@@ -3823,7 +3913,7 @@
                 <w:sz w:val="15"/>
                 <w:szCs w:val="15"/>
               </w:rPr>
-              <w:t xml:space="preserve">docs/MARKETING_GUIDE.md; marketing pages</w:t>
+              <w:t xml:space="preserve">; marketing pages</w:t>
             </w:r>
           </w:p>
         </w:tc>
@@ -4247,17 +4337,20 @@
             <w:pPr>
               <w:spacing w:after="0" w:line="250"/>
             </w:pPr>
-            <w:r>
-              <w:rPr>
-                <w:rFonts w:ascii="Calibri" w:cs="Calibri" w:eastAsia="Calibri" w:hAnsi="Calibri"/>
-                <w:b w:val="false"/>
-                <w:bCs w:val="false"/>
-                <w:color w:val="5A6472"/>
-                <w:sz w:val="15"/>
-                <w:szCs w:val="15"/>
-              </w:rPr>
-              <w:t xml:space="preserve">src/lib/legal.ts</w:t>
-            </w:r>
+            <w:hyperlink r:id="rHl9">
+              <w:r>
+                <w:rPr>
+                  <w:rFonts w:ascii="Calibri" w:cs="Calibri" w:eastAsia="Calibri" w:hAnsi="Calibri"/>
+                  <w:b w:val="false"/>
+                  <w:bCs w:val="false"/>
+                  <w:color w:val="0563C1"/>
+                  <w:u w:val="single"/>
+                  <w:sz w:val="15"/>
+                  <w:szCs w:val="15"/>
+                </w:rPr>
+                <w:t xml:space="preserve">src/lib/legal.ts</w:t>
+              </w:r>
+            </w:hyperlink>
           </w:p>
         </w:tc>
         <w:tc>
@@ -4379,17 +4472,20 @@
             <w:pPr>
               <w:spacing w:after="0" w:line="250"/>
             </w:pPr>
-            <w:r>
-              <w:rPr>
-                <w:rFonts w:ascii="Calibri" w:cs="Calibri" w:eastAsia="Calibri" w:hAnsi="Calibri"/>
-                <w:b w:val="false"/>
-                <w:bCs w:val="false"/>
-                <w:color w:val="5A6472"/>
-                <w:sz w:val="15"/>
-                <w:szCs w:val="15"/>
-              </w:rPr>
-              <w:t xml:space="preserve">src/lib/legal.ts</w:t>
-            </w:r>
+            <w:hyperlink r:id="rHl9">
+              <w:r>
+                <w:rPr>
+                  <w:rFonts w:ascii="Calibri" w:cs="Calibri" w:eastAsia="Calibri" w:hAnsi="Calibri"/>
+                  <w:b w:val="false"/>
+                  <w:bCs w:val="false"/>
+                  <w:color w:val="0563C1"/>
+                  <w:u w:val="single"/>
+                  <w:sz w:val="15"/>
+                  <w:szCs w:val="15"/>
+                </w:rPr>
+                <w:t xml:space="preserve">src/lib/legal.ts</w:t>
+              </w:r>
+            </w:hyperlink>
           </w:p>
         </w:tc>
         <w:tc>
@@ -4509,17 +4605,20 @@
             <w:pPr>
               <w:spacing w:after="0" w:line="250"/>
             </w:pPr>
-            <w:r>
-              <w:rPr>
-                <w:rFonts w:ascii="Calibri" w:cs="Calibri" w:eastAsia="Calibri" w:hAnsi="Calibri"/>
-                <w:b w:val="false"/>
-                <w:bCs w:val="false"/>
-                <w:color w:val="5A6472"/>
-                <w:sz w:val="15"/>
-                <w:szCs w:val="15"/>
-              </w:rPr>
-              <w:t xml:space="preserve">src/app/(marketing)/terms</w:t>
-            </w:r>
+            <w:hyperlink r:id="rHl18">
+              <w:r>
+                <w:rPr>
+                  <w:rFonts w:ascii="Calibri" w:cs="Calibri" w:eastAsia="Calibri" w:hAnsi="Calibri"/>
+                  <w:b w:val="false"/>
+                  <w:bCs w:val="false"/>
+                  <w:color w:val="0563C1"/>
+                  <w:u w:val="single"/>
+                  <w:sz w:val="15"/>
+                  <w:szCs w:val="15"/>
+                </w:rPr>
+                <w:t xml:space="preserve">src/app/(marketing)/terms</w:t>
+              </w:r>
+            </w:hyperlink>
           </w:p>
         </w:tc>
         <w:tc>
@@ -4641,17 +4740,20 @@
             <w:pPr>
               <w:spacing w:after="0" w:line="250"/>
             </w:pPr>
-            <w:r>
-              <w:rPr>
-                <w:rFonts w:ascii="Calibri" w:cs="Calibri" w:eastAsia="Calibri" w:hAnsi="Calibri"/>
-                <w:b w:val="false"/>
-                <w:bCs w:val="false"/>
-                <w:color w:val="5A6472"/>
-                <w:sz w:val="15"/>
-                <w:szCs w:val="15"/>
-              </w:rPr>
-              <w:t xml:space="preserve">src/app/(marketing)/privacy</w:t>
-            </w:r>
+            <w:hyperlink r:id="rHl19">
+              <w:r>
+                <w:rPr>
+                  <w:rFonts w:ascii="Calibri" w:cs="Calibri" w:eastAsia="Calibri" w:hAnsi="Calibri"/>
+                  <w:b w:val="false"/>
+                  <w:bCs w:val="false"/>
+                  <w:color w:val="0563C1"/>
+                  <w:u w:val="single"/>
+                  <w:sz w:val="15"/>
+                  <w:szCs w:val="15"/>
+                </w:rPr>
+                <w:t xml:space="preserve">src/app/(marketing)/privacy</w:t>
+              </w:r>
+            </w:hyperlink>
           </w:p>
         </w:tc>
         <w:tc>
@@ -4903,17 +5005,20 @@
             <w:pPr>
               <w:spacing w:after="0" w:line="250"/>
             </w:pPr>
-            <w:r>
-              <w:rPr>
-                <w:rFonts w:ascii="Calibri" w:cs="Calibri" w:eastAsia="Calibri" w:hAnsi="Calibri"/>
-                <w:b w:val="false"/>
-                <w:bCs w:val="false"/>
-                <w:color w:val="5A6472"/>
-                <w:sz w:val="15"/>
-                <w:szCs w:val="15"/>
-              </w:rPr>
-              <w:t xml:space="preserve">src/lib/stripe/webhook.ts</w:t>
-            </w:r>
+            <w:hyperlink r:id="rHl10">
+              <w:r>
+                <w:rPr>
+                  <w:rFonts w:ascii="Calibri" w:cs="Calibri" w:eastAsia="Calibri" w:hAnsi="Calibri"/>
+                  <w:b w:val="false"/>
+                  <w:bCs w:val="false"/>
+                  <w:color w:val="0563C1"/>
+                  <w:u w:val="single"/>
+                  <w:sz w:val="15"/>
+                  <w:szCs w:val="15"/>
+                </w:rPr>
+                <w:t xml:space="preserve">src/lib/stripe/webhook.ts</w:t>
+              </w:r>
+            </w:hyperlink>
           </w:p>
         </w:tc>
         <w:tc>
@@ -5593,17 +5698,20 @@
             <w:pPr>
               <w:spacing w:after="0" w:line="250"/>
             </w:pPr>
-            <w:r>
-              <w:rPr>
-                <w:rFonts w:ascii="Calibri" w:cs="Calibri" w:eastAsia="Calibri" w:hAnsi="Calibri"/>
-                <w:b w:val="false"/>
-                <w:bCs w:val="false"/>
-                <w:color w:val="5A6472"/>
-                <w:sz w:val="15"/>
-                <w:szCs w:val="15"/>
-              </w:rPr>
-              <w:t xml:space="preserve">src/lib/account/actions.ts</w:t>
-            </w:r>
+            <w:hyperlink r:id="rHl11">
+              <w:r>
+                <w:rPr>
+                  <w:rFonts w:ascii="Calibri" w:cs="Calibri" w:eastAsia="Calibri" w:hAnsi="Calibri"/>
+                  <w:b w:val="false"/>
+                  <w:bCs w:val="false"/>
+                  <w:color w:val="0563C1"/>
+                  <w:u w:val="single"/>
+                  <w:sz w:val="15"/>
+                  <w:szCs w:val="15"/>
+                </w:rPr>
+                <w:t xml:space="preserve">src/lib/account/actions.ts</w:t>
+              </w:r>
+            </w:hyperlink>
           </w:p>
         </w:tc>
         <w:tc>
@@ -5725,17 +5833,20 @@
             <w:pPr>
               <w:spacing w:after="0" w:line="250"/>
             </w:pPr>
-            <w:r>
-              <w:rPr>
-                <w:rFonts w:ascii="Calibri" w:cs="Calibri" w:eastAsia="Calibri" w:hAnsi="Calibri"/>
-                <w:b w:val="false"/>
-                <w:bCs w:val="false"/>
-                <w:color w:val="5A6472"/>
-                <w:sz w:val="15"/>
-                <w:szCs w:val="15"/>
-              </w:rPr>
-              <w:t xml:space="preserve">src/app/(app)/account/export</w:t>
-            </w:r>
+            <w:hyperlink r:id="rHl20">
+              <w:r>
+                <w:rPr>
+                  <w:rFonts w:ascii="Calibri" w:cs="Calibri" w:eastAsia="Calibri" w:hAnsi="Calibri"/>
+                  <w:b w:val="false"/>
+                  <w:bCs w:val="false"/>
+                  <w:color w:val="0563C1"/>
+                  <w:u w:val="single"/>
+                  <w:sz w:val="15"/>
+                  <w:szCs w:val="15"/>
+                </w:rPr>
+                <w:t xml:space="preserve">src/app/(app)/account/export</w:t>
+              </w:r>
+            </w:hyperlink>
           </w:p>
         </w:tc>
         <w:tc>
@@ -5855,17 +5966,20 @@
             <w:pPr>
               <w:spacing w:after="0" w:line="250"/>
             </w:pPr>
-            <w:r>
-              <w:rPr>
-                <w:rFonts w:ascii="Calibri" w:cs="Calibri" w:eastAsia="Calibri" w:hAnsi="Calibri"/>
-                <w:b w:val="false"/>
-                <w:bCs w:val="false"/>
-                <w:color w:val="5A6472"/>
-                <w:sz w:val="15"/>
-                <w:szCs w:val="15"/>
-              </w:rPr>
-              <w:t xml:space="preserve">docs/CRM_SALESFORCE_PLAN.md</w:t>
-            </w:r>
+            <w:hyperlink r:id="rHl12">
+              <w:r>
+                <w:rPr>
+                  <w:rFonts w:ascii="Calibri" w:cs="Calibri" w:eastAsia="Calibri" w:hAnsi="Calibri"/>
+                  <w:b w:val="false"/>
+                  <w:bCs w:val="false"/>
+                  <w:color w:val="0563C1"/>
+                  <w:u w:val="single"/>
+                  <w:sz w:val="15"/>
+                  <w:szCs w:val="15"/>
+                </w:rPr>
+                <w:t xml:space="preserve">docs/CRM_SALESFORCE_PLAN.md</w:t>
+              </w:r>
+            </w:hyperlink>
           </w:p>
         </w:tc>
         <w:tc>
@@ -6977,8 +7091,47 @@
                 <w:sz w:val="15"/>
                 <w:szCs w:val="15"/>
               </w:rPr>
-              <w:t xml:space="preserve">migration 20260712000014; src/lib/entitlements.ts</w:t>
-            </w:r>
+              <w:t xml:space="preserve">migration </w:t>
+            </w:r>
+            <w:hyperlink r:id="rHl24">
+              <w:r>
+                <w:rPr>
+                  <w:rFonts w:ascii="Calibri" w:cs="Calibri" w:eastAsia="Calibri" w:hAnsi="Calibri"/>
+                  <w:b w:val="false"/>
+                  <w:bCs w:val="false"/>
+                  <w:color w:val="0563C1"/>
+                  <w:u w:val="single"/>
+                  <w:sz w:val="15"/>
+                  <w:szCs w:val="15"/>
+                </w:rPr>
+                <w:t xml:space="preserve">20260712000014</w:t>
+              </w:r>
+            </w:hyperlink>
+            <w:r>
+              <w:rPr>
+                <w:rFonts w:ascii="Calibri" w:cs="Calibri" w:eastAsia="Calibri" w:hAnsi="Calibri"/>
+                <w:b w:val="false"/>
+                <w:bCs w:val="false"/>
+                <w:color w:val="5A6472"/>
+                <w:sz w:val="15"/>
+                <w:szCs w:val="15"/>
+              </w:rPr>
+              <w:t xml:space="preserve">; </w:t>
+            </w:r>
+            <w:hyperlink r:id="rHl25">
+              <w:r>
+                <w:rPr>
+                  <w:rFonts w:ascii="Calibri" w:cs="Calibri" w:eastAsia="Calibri" w:hAnsi="Calibri"/>
+                  <w:b w:val="false"/>
+                  <w:bCs w:val="false"/>
+                  <w:color w:val="0563C1"/>
+                  <w:u w:val="single"/>
+                  <w:sz w:val="15"/>
+                  <w:szCs w:val="15"/>
+                </w:rPr>
+                <w:t xml:space="preserve">src/lib/entitlements.ts</w:t>
+              </w:r>
+            </w:hyperlink>
           </w:p>
         </w:tc>
         <w:tc>
@@ -7100,17 +7253,20 @@
             <w:pPr>
               <w:spacing w:after="0" w:line="250"/>
             </w:pPr>
-            <w:r>
-              <w:rPr>
-                <w:rFonts w:ascii="Calibri" w:cs="Calibri" w:eastAsia="Calibri" w:hAnsi="Calibri"/>
-                <w:b w:val="false"/>
-                <w:bCs w:val="false"/>
-                <w:color w:val="5A6472"/>
-                <w:sz w:val="15"/>
-                <w:szCs w:val="15"/>
-              </w:rPr>
-              <w:t xml:space="preserve">src/lib/features.ts</w:t>
-            </w:r>
+            <w:hyperlink r:id="rHl13">
+              <w:r>
+                <w:rPr>
+                  <w:rFonts w:ascii="Calibri" w:cs="Calibri" w:eastAsia="Calibri" w:hAnsi="Calibri"/>
+                  <w:b w:val="false"/>
+                  <w:bCs w:val="false"/>
+                  <w:color w:val="0563C1"/>
+                  <w:u w:val="single"/>
+                  <w:sz w:val="15"/>
+                  <w:szCs w:val="15"/>
+                </w:rPr>
+                <w:t xml:space="preserve">src/lib/features.ts</w:t>
+              </w:r>
+            </w:hyperlink>
           </w:p>
         </w:tc>
         <w:tc>
@@ -7230,17 +7386,20 @@
             <w:pPr>
               <w:spacing w:after="0" w:line="250"/>
             </w:pPr>
-            <w:r>
-              <w:rPr>
-                <w:rFonts w:ascii="Calibri" w:cs="Calibri" w:eastAsia="Calibri" w:hAnsi="Calibri"/>
-                <w:b w:val="false"/>
-                <w:bCs w:val="false"/>
-                <w:color w:val="5A6472"/>
-                <w:sz w:val="15"/>
-                <w:szCs w:val="15"/>
-              </w:rPr>
-              <w:t xml:space="preserve">src/app/(app)/vault</w:t>
-            </w:r>
+            <w:hyperlink r:id="rHl21">
+              <w:r>
+                <w:rPr>
+                  <w:rFonts w:ascii="Calibri" w:cs="Calibri" w:eastAsia="Calibri" w:hAnsi="Calibri"/>
+                  <w:b w:val="false"/>
+                  <w:bCs w:val="false"/>
+                  <w:color w:val="0563C1"/>
+                  <w:u w:val="single"/>
+                  <w:sz w:val="15"/>
+                  <w:szCs w:val="15"/>
+                </w:rPr>
+                <w:t xml:space="preserve">src/app/(app)/vault</w:t>
+              </w:r>
+            </w:hyperlink>
           </w:p>
         </w:tc>
         <w:tc>
@@ -7362,17 +7521,20 @@
             <w:pPr>
               <w:spacing w:after="0" w:line="250"/>
             </w:pPr>
-            <w:r>
-              <w:rPr>
-                <w:rFonts w:ascii="Calibri" w:cs="Calibri" w:eastAsia="Calibri" w:hAnsi="Calibri"/>
-                <w:b w:val="false"/>
-                <w:bCs w:val="false"/>
-                <w:color w:val="5A6472"/>
-                <w:sz w:val="15"/>
-                <w:szCs w:val="15"/>
-              </w:rPr>
-              <w:t xml:space="preserve">src/lib/auth/role.ts</w:t>
-            </w:r>
+            <w:hyperlink r:id="rHl14">
+              <w:r>
+                <w:rPr>
+                  <w:rFonts w:ascii="Calibri" w:cs="Calibri" w:eastAsia="Calibri" w:hAnsi="Calibri"/>
+                  <w:b w:val="false"/>
+                  <w:bCs w:val="false"/>
+                  <w:color w:val="0563C1"/>
+                  <w:u w:val="single"/>
+                  <w:sz w:val="15"/>
+                  <w:szCs w:val="15"/>
+                </w:rPr>
+                <w:t xml:space="preserve">src/lib/auth/role.ts</w:t>
+              </w:r>
+            </w:hyperlink>
           </w:p>
         </w:tc>
         <w:tc>
@@ -7798,17 +7960,20 @@
             <w:pPr>
               <w:spacing w:after="0" w:line="250"/>
             </w:pPr>
-            <w:r>
-              <w:rPr>
-                <w:rFonts w:ascii="Calibri" w:cs="Calibri" w:eastAsia="Calibri" w:hAnsi="Calibri"/>
-                <w:b w:val="false"/>
-                <w:bCs w:val="false"/>
-                <w:color w:val="5A6472"/>
-                <w:sz w:val="15"/>
-                <w:szCs w:val="15"/>
-              </w:rPr>
-              <w:t xml:space="preserve">src/lib/pricing.ts</w:t>
-            </w:r>
+            <w:hyperlink r:id="rHl15">
+              <w:r>
+                <w:rPr>
+                  <w:rFonts w:ascii="Calibri" w:cs="Calibri" w:eastAsia="Calibri" w:hAnsi="Calibri"/>
+                  <w:b w:val="false"/>
+                  <w:bCs w:val="false"/>
+                  <w:color w:val="0563C1"/>
+                  <w:u w:val="single"/>
+                  <w:sz w:val="15"/>
+                  <w:szCs w:val="15"/>
+                </w:rPr>
+                <w:t xml:space="preserve">src/lib/pricing.ts</w:t>
+              </w:r>
+            </w:hyperlink>
           </w:p>
         </w:tc>
         <w:tc>
@@ -8060,17 +8225,20 @@
             <w:pPr>
               <w:spacing w:after="0" w:line="250"/>
             </w:pPr>
-            <w:r>
-              <w:rPr>
-                <w:rFonts w:ascii="Calibri" w:cs="Calibri" w:eastAsia="Calibri" w:hAnsi="Calibri"/>
-                <w:b w:val="false"/>
-                <w:bCs w:val="false"/>
-                <w:color w:val="5A6472"/>
-                <w:sz w:val="15"/>
-                <w:szCs w:val="15"/>
-              </w:rPr>
-              <w:t xml:space="preserve">src/lib/stripe/webhook.ts</w:t>
-            </w:r>
+            <w:hyperlink r:id="rHl10">
+              <w:r>
+                <w:rPr>
+                  <w:rFonts w:ascii="Calibri" w:cs="Calibri" w:eastAsia="Calibri" w:hAnsi="Calibri"/>
+                  <w:b w:val="false"/>
+                  <w:bCs w:val="false"/>
+                  <w:color w:val="0563C1"/>
+                  <w:u w:val="single"/>
+                  <w:sz w:val="15"/>
+                  <w:szCs w:val="15"/>
+                </w:rPr>
+                <w:t xml:space="preserve">src/lib/stripe/webhook.ts</w:t>
+              </w:r>
+            </w:hyperlink>
           </w:p>
         </w:tc>
         <w:tc>

</xml_diff>